<commit_message>
updated documentation for authorization
</commit_message>
<xml_diff>
--- a/docs/كتاب المشروع.docx
+++ b/docs/كتاب المشروع.docx
@@ -300,13 +300,7 @@
         <w:rPr>
           <w:rtl/>
         </w:rPr>
-        <w:t>تُعدّ السجلات الطبية حجر الأساس في تقديم رعاية صحّية آمنة وفعّالة؛ فهي الذاكرة التي تختزن تاريخ المريض من تشخيصاتٍ وأدويةٍ وفحوصٍ وإجراءات. غير أنّ هذه السجلات غالباً ما تكون موزّعة بين أنظمةٍ غير متوافقة لا يتبادل بعضها البيانات مع بعض، ما يضعف التنسيق بين مقدّمي الرعاية، ويؤدّي إلى تكرار الفحوص، وإلى قراراتٍ سريرية تُتّخذ أحياناً من دون صورةٍ كاملة عن حالة المريض. من هنا جاءت فكرة هذا المشروع: بناء نظامٍ حديث لإدارة السجلات الطبية الرقمية يعتمد على المعيار العالمي HL7 FHIR في إصداره الخامس (R5) لضمان قابل</w:t>
-      </w:r>
-      <w:r>
-        <w:rPr>
-          <w:rtl/>
-        </w:rPr>
-        <w:t>ية التشغيل البيني (Interoperability) بين الأنظمة الصحية المختلفة.</w:t>
+        <w:t>تُعدّ السجلات الطبية حجر الأساس في تقديم رعاية صحّية آمنة وفعّالة؛ فهي الذاكرة التي تختزن تاريخ المريض من تشخيصاتٍ وأدويةٍ وفحوصٍ وإجراءات. غير أنّ هذه السجلات غالباً ما تكون موزّعة بين أنظمةٍ غير متوافقة لا يتبادل بعضها البيانات مع بعض، ما يضعف التنسيق بين مقدّمي الرعاية، ويؤدّي إلى تكرار الفحوص، وإلى قراراتٍ سريرية تُتّخذ أحياناً من دون صورةٍ كاملة عن حالة المريض. من هنا جاءت فكرة هذا المشروع: بناء نظامٍ حديث لإدارة السجلات الطبية الرقمية يعتمد على المعيار العالمي HL7 FHIR في إصداره الخامس (R5) لضمان قابلية التشغيل البيني (Interoperability) بين الأنظمة الصحية المختلفة.</w:t>
       </w:r>
     </w:p>
     <w:p>
@@ -319,13 +313,7 @@
         <w:rPr>
           <w:rtl/>
         </w:rPr>
-        <w:t>يجمع النظام بين عدّة طبقاتٍ متكاملة: سجلٌّ طبي قائم على معيار FHIR لإدارة بيانات المرضى والتشخيصات والملاحظات والأدوية والإجراءات والمواعيد، مع حفظٍ كامل لتاريخ النسخ والتعديلات؛ ومحرّك دعم قرار سريري (Clinical Decision Support) قابل للتهيئة يُطلق تنبيهاتٍ للأطباء في موضع الرعاية وفق قواعد منطقية مرنة؛ وطبقة ذكاء اصطناعي تضمّ ثلاثة نماذج تنبّؤية تُقدّر مخاطر المريض انطلاقاً من بياناته الفعلية: خطر الإصابة بالسكري، وخطر أمراض القلب، وخطر إعادة الدخول إلى المشفى خلال ثلاثين يوماً. ويُضاف إلى ذلك سجلٌّ لربط نم</w:t>
-      </w:r>
-      <w:r>
-        <w:rPr>
-          <w:rtl/>
-        </w:rPr>
-        <w:t>اذج ذكاء اصطناعي خارجية، وبوابة خدمة ذاتية للمريض، ودعم كامل للّغتين العربية والإنجليزية.</w:t>
+        <w:t>يجمع النظام بين عدّة طبقاتٍ متكاملة: سجلٌّ طبي قائم على معيار FHIR لإدارة بيانات المرضى والتشخيصات والملاحظات والأدوية والإجراءات والمواعيد، مع حفظٍ كامل لتاريخ النسخ والتعديلات؛ ومحرّك دعم قرار سريري (Clinical Decision Support) قابل للتهيئة يُطلق تنبيهاتٍ للأطباء في موضع الرعاية وفق قواعد منطقية مرنة؛ وطبقة ذكاء اصطناعي تضمّ ثلاثة نماذج تنبّؤية تُقدّر مخاطر المريض انطلاقاً من بياناته الفعلية: خطر الإصابة بالسكري، وخطر أمراض القلب، وخطر إعادة الدخول إلى المشفى خلال ثلاثين يوماً. ويُضاف إلى ذلك سجلٌّ لربط نماذج ذكاء اصطناعي خارجية، وبوابة خدمة ذاتية للمريض، ودعم كامل للّغتين العربية والإنجليزية.</w:t>
       </w:r>
     </w:p>
     <w:p>
@@ -376,10 +364,7 @@
         <w:jc w:val="both"/>
       </w:pPr>
       <w:r>
-        <w:t>Medical records are the foundation of safe and effective healthcare, yet they are often scattered across incompatible systems that do not exchange data — weakening coordination between care providers, causing repeated tests, and delaying clinical decisions made without a complete picture of the patient. This project addresses that challenge by building a modern Digital Medical Records System (DMRS) based on the international HL7 FHIR (Release 5) standard to guarantee interoperability between healthcare syst</w:t>
-      </w:r>
-      <w:r>
-        <w:t>ems.</w:t>
+        <w:t>Medical records are the foundation of safe and effective healthcare, yet they are often scattered across incompatible systems that do not exchange data — weakening coordination between care providers, causing repeated tests, and delaying clinical decisions made without a complete picture of the patient. This project addresses that challenge by building a modern Digital Medical Records System (DMRS) based on the international HL7 FHIR (Release 5) standard to guarantee interoperability between healthcare systems.</w:t>
       </w:r>
     </w:p>
     <w:p>
@@ -389,8 +374,6 @@
       </w:pPr>
       <w:r>
         <w:t xml:space="preserve">The system combines several integrated layers: a FHIR-based clinical record that manages patients, conditions, observations, medications, procedures and appointments with full version history; a configurable Clinical Decision Support </w:t>
-      </w:r>
-      <w:r>
         <w:lastRenderedPageBreak/>
         <w:t>(CDS) engine that alerts clinicians at the point of care through a flexible rule engine; and an artificial-intelligence layer of three predictive models that estimate patient risk from real FHIR data — diabetes risk, cardiovascular risk, and 30-day hospital readmission risk. It also adds a registry for external AI models, a patient self-service portal, and full Arabic/English localization.</w:t>
       </w:r>
@@ -457,11 +440,7 @@
           </w:pPr>
           <w:r>
             <w:fldChar w:fldCharType="begin"/>
-          </w:r>
-          <w:r>
             <w:instrText>TOC \h \o "1-3"</w:instrText>
-          </w:r>
-          <w:r>
             <w:fldChar w:fldCharType="separate"/>
           </w:r>
           <w:hyperlink w:anchor="_Toc232664092" w:history="1">
@@ -478,40 +457,10 @@
                 <w:noProof/>
               </w:rPr>
               <w:tab/>
-            </w:r>
-            <w:r>
-              <w:rPr>
-                <w:noProof/>
-              </w:rPr>
               <w:fldChar w:fldCharType="begin"/>
-            </w:r>
-            <w:r>
-              <w:rPr>
-                <w:noProof/>
-              </w:rPr>
               <w:instrText xml:space="preserve"> PAGEREF _Toc232664092 \h </w:instrText>
-            </w:r>
-            <w:r>
-              <w:rPr>
-                <w:noProof/>
-              </w:rPr>
-            </w:r>
-            <w:r>
-              <w:rPr>
-                <w:noProof/>
-              </w:rPr>
               <w:fldChar w:fldCharType="separate"/>
-            </w:r>
-            <w:r>
-              <w:rPr>
-                <w:noProof/>
-              </w:rPr>
               <w:t>2</w:t>
-            </w:r>
-            <w:r>
-              <w:rPr>
-                <w:noProof/>
-              </w:rPr>
               <w:fldChar w:fldCharType="end"/>
             </w:r>
           </w:hyperlink>
@@ -545,40 +494,10 @@
                 <w:noProof/>
               </w:rPr>
               <w:tab/>
-            </w:r>
-            <w:r>
-              <w:rPr>
-                <w:noProof/>
-              </w:rPr>
               <w:fldChar w:fldCharType="begin"/>
-            </w:r>
-            <w:r>
-              <w:rPr>
-                <w:noProof/>
-              </w:rPr>
               <w:instrText xml:space="preserve"> PAGEREF _Toc232664093 \h </w:instrText>
-            </w:r>
-            <w:r>
-              <w:rPr>
-                <w:noProof/>
-              </w:rPr>
-            </w:r>
-            <w:r>
-              <w:rPr>
-                <w:noProof/>
-              </w:rPr>
               <w:fldChar w:fldCharType="separate"/>
-            </w:r>
-            <w:r>
-              <w:rPr>
-                <w:noProof/>
-              </w:rPr>
               <w:t>3</w:t>
-            </w:r>
-            <w:r>
-              <w:rPr>
-                <w:noProof/>
-              </w:rPr>
               <w:fldChar w:fldCharType="end"/>
             </w:r>
           </w:hyperlink>
@@ -612,40 +531,10 @@
                 <w:noProof/>
               </w:rPr>
               <w:tab/>
-            </w:r>
-            <w:r>
-              <w:rPr>
-                <w:noProof/>
-              </w:rPr>
               <w:fldChar w:fldCharType="begin"/>
-            </w:r>
-            <w:r>
-              <w:rPr>
-                <w:noProof/>
-              </w:rPr>
               <w:instrText xml:space="preserve"> PAGEREF _Toc232664094 \h </w:instrText>
-            </w:r>
-            <w:r>
-              <w:rPr>
-                <w:noProof/>
-              </w:rPr>
-            </w:r>
-            <w:r>
-              <w:rPr>
-                <w:noProof/>
-              </w:rPr>
               <w:fldChar w:fldCharType="separate"/>
-            </w:r>
-            <w:r>
-              <w:rPr>
-                <w:noProof/>
-              </w:rPr>
               <w:t>3</w:t>
-            </w:r>
-            <w:r>
-              <w:rPr>
-                <w:noProof/>
-              </w:rPr>
               <w:fldChar w:fldCharType="end"/>
             </w:r>
           </w:hyperlink>
@@ -679,40 +568,10 @@
                 <w:noProof/>
               </w:rPr>
               <w:tab/>
-            </w:r>
-            <w:r>
-              <w:rPr>
-                <w:noProof/>
-              </w:rPr>
               <w:fldChar w:fldCharType="begin"/>
-            </w:r>
-            <w:r>
-              <w:rPr>
-                <w:noProof/>
-              </w:rPr>
               <w:instrText xml:space="preserve"> PAGEREF _Toc232664095 \h </w:instrText>
-            </w:r>
-            <w:r>
-              <w:rPr>
-                <w:noProof/>
-              </w:rPr>
-            </w:r>
-            <w:r>
-              <w:rPr>
-                <w:noProof/>
-              </w:rPr>
               <w:fldChar w:fldCharType="separate"/>
-            </w:r>
-            <w:r>
-              <w:rPr>
-                <w:noProof/>
-              </w:rPr>
               <w:t>5</w:t>
-            </w:r>
-            <w:r>
-              <w:rPr>
-                <w:noProof/>
-              </w:rPr>
               <w:fldChar w:fldCharType="end"/>
             </w:r>
           </w:hyperlink>
@@ -746,40 +605,10 @@
                 <w:noProof/>
               </w:rPr>
               <w:tab/>
-            </w:r>
-            <w:r>
-              <w:rPr>
-                <w:noProof/>
-              </w:rPr>
               <w:fldChar w:fldCharType="begin"/>
-            </w:r>
-            <w:r>
-              <w:rPr>
-                <w:noProof/>
-              </w:rPr>
               <w:instrText xml:space="preserve"> PAGEREF _Toc232664096 \h </w:instrText>
-            </w:r>
-            <w:r>
-              <w:rPr>
-                <w:noProof/>
-              </w:rPr>
-            </w:r>
-            <w:r>
-              <w:rPr>
-                <w:noProof/>
-              </w:rPr>
               <w:fldChar w:fldCharType="separate"/>
-            </w:r>
-            <w:r>
-              <w:rPr>
-                <w:noProof/>
-              </w:rPr>
               <w:t>8</w:t>
-            </w:r>
-            <w:r>
-              <w:rPr>
-                <w:noProof/>
-              </w:rPr>
               <w:fldChar w:fldCharType="end"/>
             </w:r>
           </w:hyperlink>
@@ -813,40 +642,10 @@
                 <w:noProof/>
               </w:rPr>
               <w:tab/>
-            </w:r>
-            <w:r>
-              <w:rPr>
-                <w:noProof/>
-              </w:rPr>
               <w:fldChar w:fldCharType="begin"/>
-            </w:r>
-            <w:r>
-              <w:rPr>
-                <w:noProof/>
-              </w:rPr>
               <w:instrText xml:space="preserve"> PAGEREF _Toc232664097 \h </w:instrText>
-            </w:r>
-            <w:r>
-              <w:rPr>
-                <w:noProof/>
-              </w:rPr>
-            </w:r>
-            <w:r>
-              <w:rPr>
-                <w:noProof/>
-              </w:rPr>
               <w:fldChar w:fldCharType="separate"/>
-            </w:r>
-            <w:r>
-              <w:rPr>
-                <w:noProof/>
-              </w:rPr>
               <w:t>8</w:t>
-            </w:r>
-            <w:r>
-              <w:rPr>
-                <w:noProof/>
-              </w:rPr>
               <w:fldChar w:fldCharType="end"/>
             </w:r>
           </w:hyperlink>
@@ -880,40 +679,10 @@
                 <w:noProof/>
               </w:rPr>
               <w:tab/>
-            </w:r>
-            <w:r>
-              <w:rPr>
-                <w:noProof/>
-              </w:rPr>
               <w:fldChar w:fldCharType="begin"/>
-            </w:r>
-            <w:r>
-              <w:rPr>
-                <w:noProof/>
-              </w:rPr>
               <w:instrText xml:space="preserve"> PAGEREF _Toc232664098 \h </w:instrText>
-            </w:r>
-            <w:r>
-              <w:rPr>
-                <w:noProof/>
-              </w:rPr>
-            </w:r>
-            <w:r>
-              <w:rPr>
-                <w:noProof/>
-              </w:rPr>
               <w:fldChar w:fldCharType="separate"/>
-            </w:r>
-            <w:r>
-              <w:rPr>
-                <w:noProof/>
-              </w:rPr>
               <w:t>9</w:t>
-            </w:r>
-            <w:r>
-              <w:rPr>
-                <w:noProof/>
-              </w:rPr>
               <w:fldChar w:fldCharType="end"/>
             </w:r>
           </w:hyperlink>
@@ -947,40 +716,10 @@
                 <w:noProof/>
               </w:rPr>
               <w:tab/>
-            </w:r>
-            <w:r>
-              <w:rPr>
-                <w:noProof/>
-              </w:rPr>
               <w:fldChar w:fldCharType="begin"/>
-            </w:r>
-            <w:r>
-              <w:rPr>
-                <w:noProof/>
-              </w:rPr>
               <w:instrText xml:space="preserve"> PAGEREF _Toc232664099 \h </w:instrText>
-            </w:r>
-            <w:r>
-              <w:rPr>
-                <w:noProof/>
-              </w:rPr>
-            </w:r>
-            <w:r>
-              <w:rPr>
-                <w:noProof/>
-              </w:rPr>
               <w:fldChar w:fldCharType="separate"/>
-            </w:r>
-            <w:r>
-              <w:rPr>
-                <w:noProof/>
-              </w:rPr>
               <w:t>9</w:t>
-            </w:r>
-            <w:r>
-              <w:rPr>
-                <w:noProof/>
-              </w:rPr>
               <w:fldChar w:fldCharType="end"/>
             </w:r>
           </w:hyperlink>
@@ -1014,40 +753,10 @@
                 <w:noProof/>
               </w:rPr>
               <w:tab/>
-            </w:r>
-            <w:r>
-              <w:rPr>
-                <w:noProof/>
-              </w:rPr>
               <w:fldChar w:fldCharType="begin"/>
-            </w:r>
-            <w:r>
-              <w:rPr>
-                <w:noProof/>
-              </w:rPr>
               <w:instrText xml:space="preserve"> PAGEREF _Toc232664100 \h </w:instrText>
-            </w:r>
-            <w:r>
-              <w:rPr>
-                <w:noProof/>
-              </w:rPr>
-            </w:r>
-            <w:r>
-              <w:rPr>
-                <w:noProof/>
-              </w:rPr>
               <w:fldChar w:fldCharType="separate"/>
-            </w:r>
-            <w:r>
-              <w:rPr>
-                <w:noProof/>
-              </w:rPr>
               <w:t>9</w:t>
-            </w:r>
-            <w:r>
-              <w:rPr>
-                <w:noProof/>
-              </w:rPr>
               <w:fldChar w:fldCharType="end"/>
             </w:r>
           </w:hyperlink>
@@ -1081,40 +790,10 @@
                 <w:noProof/>
               </w:rPr>
               <w:tab/>
-            </w:r>
-            <w:r>
-              <w:rPr>
-                <w:noProof/>
-              </w:rPr>
               <w:fldChar w:fldCharType="begin"/>
-            </w:r>
-            <w:r>
-              <w:rPr>
-                <w:noProof/>
-              </w:rPr>
               <w:instrText xml:space="preserve"> PAGEREF _Toc232664101 \h </w:instrText>
-            </w:r>
-            <w:r>
-              <w:rPr>
-                <w:noProof/>
-              </w:rPr>
-            </w:r>
-            <w:r>
-              <w:rPr>
-                <w:noProof/>
-              </w:rPr>
               <w:fldChar w:fldCharType="separate"/>
-            </w:r>
-            <w:r>
-              <w:rPr>
-                <w:noProof/>
-              </w:rPr>
               <w:t>10</w:t>
-            </w:r>
-            <w:r>
-              <w:rPr>
-                <w:noProof/>
-              </w:rPr>
               <w:fldChar w:fldCharType="end"/>
             </w:r>
           </w:hyperlink>
@@ -1148,40 +827,10 @@
                 <w:noProof/>
               </w:rPr>
               <w:tab/>
-            </w:r>
-            <w:r>
-              <w:rPr>
-                <w:noProof/>
-              </w:rPr>
               <w:fldChar w:fldCharType="begin"/>
-            </w:r>
-            <w:r>
-              <w:rPr>
-                <w:noProof/>
-              </w:rPr>
               <w:instrText xml:space="preserve"> PAGEREF _Toc232664102 \h </w:instrText>
-            </w:r>
-            <w:r>
-              <w:rPr>
-                <w:noProof/>
-              </w:rPr>
-            </w:r>
-            <w:r>
-              <w:rPr>
-                <w:noProof/>
-              </w:rPr>
               <w:fldChar w:fldCharType="separate"/>
-            </w:r>
-            <w:r>
-              <w:rPr>
-                <w:noProof/>
-              </w:rPr>
               <w:t>12</w:t>
-            </w:r>
-            <w:r>
-              <w:rPr>
-                <w:noProof/>
-              </w:rPr>
               <w:fldChar w:fldCharType="end"/>
             </w:r>
           </w:hyperlink>
@@ -1215,40 +864,10 @@
                 <w:noProof/>
               </w:rPr>
               <w:tab/>
-            </w:r>
-            <w:r>
-              <w:rPr>
-                <w:noProof/>
-              </w:rPr>
               <w:fldChar w:fldCharType="begin"/>
-            </w:r>
-            <w:r>
-              <w:rPr>
-                <w:noProof/>
-              </w:rPr>
               <w:instrText xml:space="preserve"> PAGEREF _Toc232664103 \h </w:instrText>
-            </w:r>
-            <w:r>
-              <w:rPr>
-                <w:noProof/>
-              </w:rPr>
-            </w:r>
-            <w:r>
-              <w:rPr>
-                <w:noProof/>
-              </w:rPr>
               <w:fldChar w:fldCharType="separate"/>
-            </w:r>
-            <w:r>
-              <w:rPr>
-                <w:noProof/>
-              </w:rPr>
               <w:t>12</w:t>
-            </w:r>
-            <w:r>
-              <w:rPr>
-                <w:noProof/>
-              </w:rPr>
               <w:fldChar w:fldCharType="end"/>
             </w:r>
           </w:hyperlink>
@@ -1282,40 +901,10 @@
                 <w:noProof/>
               </w:rPr>
               <w:tab/>
-            </w:r>
-            <w:r>
-              <w:rPr>
-                <w:noProof/>
-              </w:rPr>
               <w:fldChar w:fldCharType="begin"/>
-            </w:r>
-            <w:r>
-              <w:rPr>
-                <w:noProof/>
-              </w:rPr>
               <w:instrText xml:space="preserve"> PAGEREF _Toc232664104 \h </w:instrText>
-            </w:r>
-            <w:r>
-              <w:rPr>
-                <w:noProof/>
-              </w:rPr>
-            </w:r>
-            <w:r>
-              <w:rPr>
-                <w:noProof/>
-              </w:rPr>
               <w:fldChar w:fldCharType="separate"/>
-            </w:r>
-            <w:r>
-              <w:rPr>
-                <w:noProof/>
-              </w:rPr>
               <w:t>12</w:t>
-            </w:r>
-            <w:r>
-              <w:rPr>
-                <w:noProof/>
-              </w:rPr>
               <w:fldChar w:fldCharType="end"/>
             </w:r>
           </w:hyperlink>
@@ -1349,40 +938,10 @@
                 <w:noProof/>
               </w:rPr>
               <w:tab/>
-            </w:r>
-            <w:r>
-              <w:rPr>
-                <w:noProof/>
-              </w:rPr>
               <w:fldChar w:fldCharType="begin"/>
-            </w:r>
-            <w:r>
-              <w:rPr>
-                <w:noProof/>
-              </w:rPr>
               <w:instrText xml:space="preserve"> PAGEREF _Toc232664105 \h </w:instrText>
-            </w:r>
-            <w:r>
-              <w:rPr>
-                <w:noProof/>
-              </w:rPr>
-            </w:r>
-            <w:r>
-              <w:rPr>
-                <w:noProof/>
-              </w:rPr>
               <w:fldChar w:fldCharType="separate"/>
-            </w:r>
-            <w:r>
-              <w:rPr>
-                <w:noProof/>
-              </w:rPr>
               <w:t>12</w:t>
-            </w:r>
-            <w:r>
-              <w:rPr>
-                <w:noProof/>
-              </w:rPr>
               <w:fldChar w:fldCharType="end"/>
             </w:r>
           </w:hyperlink>
@@ -1416,40 +975,10 @@
                 <w:noProof/>
               </w:rPr>
               <w:tab/>
-            </w:r>
-            <w:r>
-              <w:rPr>
-                <w:noProof/>
-              </w:rPr>
               <w:fldChar w:fldCharType="begin"/>
-            </w:r>
-            <w:r>
-              <w:rPr>
-                <w:noProof/>
-              </w:rPr>
               <w:instrText xml:space="preserve"> PAGEREF _Toc232664106 \h </w:instrText>
-            </w:r>
-            <w:r>
-              <w:rPr>
-                <w:noProof/>
-              </w:rPr>
-            </w:r>
-            <w:r>
-              <w:rPr>
-                <w:noProof/>
-              </w:rPr>
               <w:fldChar w:fldCharType="separate"/>
-            </w:r>
-            <w:r>
-              <w:rPr>
-                <w:noProof/>
-              </w:rPr>
               <w:t>13</w:t>
-            </w:r>
-            <w:r>
-              <w:rPr>
-                <w:noProof/>
-              </w:rPr>
               <w:fldChar w:fldCharType="end"/>
             </w:r>
           </w:hyperlink>
@@ -1483,40 +1012,10 @@
                 <w:noProof/>
               </w:rPr>
               <w:tab/>
-            </w:r>
-            <w:r>
-              <w:rPr>
-                <w:noProof/>
-              </w:rPr>
               <w:fldChar w:fldCharType="begin"/>
-            </w:r>
-            <w:r>
-              <w:rPr>
-                <w:noProof/>
-              </w:rPr>
               <w:instrText xml:space="preserve"> PAGEREF _Toc232664107 \h </w:instrText>
-            </w:r>
-            <w:r>
-              <w:rPr>
-                <w:noProof/>
-              </w:rPr>
-            </w:r>
-            <w:r>
-              <w:rPr>
-                <w:noProof/>
-              </w:rPr>
               <w:fldChar w:fldCharType="separate"/>
-            </w:r>
-            <w:r>
-              <w:rPr>
-                <w:noProof/>
-              </w:rPr>
               <w:t>13</w:t>
-            </w:r>
-            <w:r>
-              <w:rPr>
-                <w:noProof/>
-              </w:rPr>
               <w:fldChar w:fldCharType="end"/>
             </w:r>
           </w:hyperlink>
@@ -1550,40 +1049,10 @@
                 <w:noProof/>
               </w:rPr>
               <w:tab/>
-            </w:r>
-            <w:r>
-              <w:rPr>
-                <w:noProof/>
-              </w:rPr>
               <w:fldChar w:fldCharType="begin"/>
-            </w:r>
-            <w:r>
-              <w:rPr>
-                <w:noProof/>
-              </w:rPr>
               <w:instrText xml:space="preserve"> PAGEREF _Toc232664108 \h </w:instrText>
-            </w:r>
-            <w:r>
-              <w:rPr>
-                <w:noProof/>
-              </w:rPr>
-            </w:r>
-            <w:r>
-              <w:rPr>
-                <w:noProof/>
-              </w:rPr>
               <w:fldChar w:fldCharType="separate"/>
-            </w:r>
-            <w:r>
-              <w:rPr>
-                <w:noProof/>
-              </w:rPr>
               <w:t>13</w:t>
-            </w:r>
-            <w:r>
-              <w:rPr>
-                <w:noProof/>
-              </w:rPr>
               <w:fldChar w:fldCharType="end"/>
             </w:r>
           </w:hyperlink>
@@ -1617,40 +1086,10 @@
                 <w:noProof/>
               </w:rPr>
               <w:tab/>
-            </w:r>
-            <w:r>
-              <w:rPr>
-                <w:noProof/>
-              </w:rPr>
               <w:fldChar w:fldCharType="begin"/>
-            </w:r>
-            <w:r>
-              <w:rPr>
-                <w:noProof/>
-              </w:rPr>
               <w:instrText xml:space="preserve"> PAGEREF _Toc232664109 \h </w:instrText>
-            </w:r>
-            <w:r>
-              <w:rPr>
-                <w:noProof/>
-              </w:rPr>
-            </w:r>
-            <w:r>
-              <w:rPr>
-                <w:noProof/>
-              </w:rPr>
               <w:fldChar w:fldCharType="separate"/>
-            </w:r>
-            <w:r>
-              <w:rPr>
-                <w:noProof/>
-              </w:rPr>
               <w:t>14</w:t>
-            </w:r>
-            <w:r>
-              <w:rPr>
-                <w:noProof/>
-              </w:rPr>
               <w:fldChar w:fldCharType="end"/>
             </w:r>
           </w:hyperlink>
@@ -1684,40 +1123,10 @@
                 <w:noProof/>
               </w:rPr>
               <w:tab/>
-            </w:r>
-            <w:r>
-              <w:rPr>
-                <w:noProof/>
-              </w:rPr>
               <w:fldChar w:fldCharType="begin"/>
-            </w:r>
-            <w:r>
-              <w:rPr>
-                <w:noProof/>
-              </w:rPr>
               <w:instrText xml:space="preserve"> PAGEREF _Toc232664110 \h </w:instrText>
-            </w:r>
-            <w:r>
-              <w:rPr>
-                <w:noProof/>
-              </w:rPr>
-            </w:r>
-            <w:r>
-              <w:rPr>
-                <w:noProof/>
-              </w:rPr>
               <w:fldChar w:fldCharType="separate"/>
-            </w:r>
-            <w:r>
-              <w:rPr>
-                <w:noProof/>
-              </w:rPr>
               <w:t>14</w:t>
-            </w:r>
-            <w:r>
-              <w:rPr>
-                <w:noProof/>
-              </w:rPr>
               <w:fldChar w:fldCharType="end"/>
             </w:r>
           </w:hyperlink>
@@ -1751,40 +1160,10 @@
                 <w:noProof/>
               </w:rPr>
               <w:tab/>
-            </w:r>
-            <w:r>
-              <w:rPr>
-                <w:noProof/>
-              </w:rPr>
               <w:fldChar w:fldCharType="begin"/>
-            </w:r>
-            <w:r>
-              <w:rPr>
-                <w:noProof/>
-              </w:rPr>
               <w:instrText xml:space="preserve"> PAGEREF _Toc232664111 \h </w:instrText>
-            </w:r>
-            <w:r>
-              <w:rPr>
-                <w:noProof/>
-              </w:rPr>
-            </w:r>
-            <w:r>
-              <w:rPr>
-                <w:noProof/>
-              </w:rPr>
               <w:fldChar w:fldCharType="separate"/>
-            </w:r>
-            <w:r>
-              <w:rPr>
-                <w:noProof/>
-              </w:rPr>
               <w:t>14</w:t>
-            </w:r>
-            <w:r>
-              <w:rPr>
-                <w:noProof/>
-              </w:rPr>
               <w:fldChar w:fldCharType="end"/>
             </w:r>
           </w:hyperlink>
@@ -1818,40 +1197,10 @@
                 <w:noProof/>
               </w:rPr>
               <w:tab/>
-            </w:r>
-            <w:r>
-              <w:rPr>
-                <w:noProof/>
-              </w:rPr>
               <w:fldChar w:fldCharType="begin"/>
-            </w:r>
-            <w:r>
-              <w:rPr>
-                <w:noProof/>
-              </w:rPr>
               <w:instrText xml:space="preserve"> PAGEREF _Toc232664112 \h </w:instrText>
-            </w:r>
-            <w:r>
-              <w:rPr>
-                <w:noProof/>
-              </w:rPr>
-            </w:r>
-            <w:r>
-              <w:rPr>
-                <w:noProof/>
-              </w:rPr>
               <w:fldChar w:fldCharType="separate"/>
-            </w:r>
-            <w:r>
-              <w:rPr>
-                <w:noProof/>
-              </w:rPr>
               <w:t>14</w:t>
-            </w:r>
-            <w:r>
-              <w:rPr>
-                <w:noProof/>
-              </w:rPr>
               <w:fldChar w:fldCharType="end"/>
             </w:r>
           </w:hyperlink>
@@ -1885,40 +1234,10 @@
                 <w:noProof/>
               </w:rPr>
               <w:tab/>
-            </w:r>
-            <w:r>
-              <w:rPr>
-                <w:noProof/>
-              </w:rPr>
               <w:fldChar w:fldCharType="begin"/>
-            </w:r>
-            <w:r>
-              <w:rPr>
-                <w:noProof/>
-              </w:rPr>
               <w:instrText xml:space="preserve"> PAGEREF _Toc232664113 \h </w:instrText>
-            </w:r>
-            <w:r>
-              <w:rPr>
-                <w:noProof/>
-              </w:rPr>
-            </w:r>
-            <w:r>
-              <w:rPr>
-                <w:noProof/>
-              </w:rPr>
               <w:fldChar w:fldCharType="separate"/>
-            </w:r>
-            <w:r>
-              <w:rPr>
-                <w:noProof/>
-              </w:rPr>
               <w:t>14</w:t>
-            </w:r>
-            <w:r>
-              <w:rPr>
-                <w:noProof/>
-              </w:rPr>
               <w:fldChar w:fldCharType="end"/>
             </w:r>
           </w:hyperlink>
@@ -1952,40 +1271,10 @@
                 <w:noProof/>
               </w:rPr>
               <w:tab/>
-            </w:r>
-            <w:r>
-              <w:rPr>
-                <w:noProof/>
-              </w:rPr>
               <w:fldChar w:fldCharType="begin"/>
-            </w:r>
-            <w:r>
-              <w:rPr>
-                <w:noProof/>
-              </w:rPr>
               <w:instrText xml:space="preserve"> PAGEREF _Toc232664114 \h </w:instrText>
-            </w:r>
-            <w:r>
-              <w:rPr>
-                <w:noProof/>
-              </w:rPr>
-            </w:r>
-            <w:r>
-              <w:rPr>
-                <w:noProof/>
-              </w:rPr>
               <w:fldChar w:fldCharType="separate"/>
-            </w:r>
-            <w:r>
-              <w:rPr>
-                <w:noProof/>
-              </w:rPr>
               <w:t>15</w:t>
-            </w:r>
-            <w:r>
-              <w:rPr>
-                <w:noProof/>
-              </w:rPr>
               <w:fldChar w:fldCharType="end"/>
             </w:r>
           </w:hyperlink>
@@ -2019,40 +1308,10 @@
                 <w:noProof/>
               </w:rPr>
               <w:tab/>
-            </w:r>
-            <w:r>
-              <w:rPr>
-                <w:noProof/>
-              </w:rPr>
               <w:fldChar w:fldCharType="begin"/>
-            </w:r>
-            <w:r>
-              <w:rPr>
-                <w:noProof/>
-              </w:rPr>
               <w:instrText xml:space="preserve"> PAGEREF _Toc232664115 \h </w:instrText>
-            </w:r>
-            <w:r>
-              <w:rPr>
-                <w:noProof/>
-              </w:rPr>
-            </w:r>
-            <w:r>
-              <w:rPr>
-                <w:noProof/>
-              </w:rPr>
               <w:fldChar w:fldCharType="separate"/>
-            </w:r>
-            <w:r>
-              <w:rPr>
-                <w:noProof/>
-              </w:rPr>
               <w:t>15</w:t>
-            </w:r>
-            <w:r>
-              <w:rPr>
-                <w:noProof/>
-              </w:rPr>
               <w:fldChar w:fldCharType="end"/>
             </w:r>
           </w:hyperlink>
@@ -2086,40 +1345,10 @@
                 <w:noProof/>
               </w:rPr>
               <w:tab/>
-            </w:r>
-            <w:r>
-              <w:rPr>
-                <w:noProof/>
-              </w:rPr>
               <w:fldChar w:fldCharType="begin"/>
-            </w:r>
-            <w:r>
-              <w:rPr>
-                <w:noProof/>
-              </w:rPr>
               <w:instrText xml:space="preserve"> PAGEREF _Toc232664116 \h </w:instrText>
-            </w:r>
-            <w:r>
-              <w:rPr>
-                <w:noProof/>
-              </w:rPr>
-            </w:r>
-            <w:r>
-              <w:rPr>
-                <w:noProof/>
-              </w:rPr>
               <w:fldChar w:fldCharType="separate"/>
-            </w:r>
-            <w:r>
-              <w:rPr>
-                <w:noProof/>
-              </w:rPr>
               <w:t>15</w:t>
-            </w:r>
-            <w:r>
-              <w:rPr>
-                <w:noProof/>
-              </w:rPr>
               <w:fldChar w:fldCharType="end"/>
             </w:r>
           </w:hyperlink>
@@ -2153,40 +1382,10 @@
                 <w:noProof/>
               </w:rPr>
               <w:tab/>
-            </w:r>
-            <w:r>
-              <w:rPr>
-                <w:noProof/>
-              </w:rPr>
               <w:fldChar w:fldCharType="begin"/>
-            </w:r>
-            <w:r>
-              <w:rPr>
-                <w:noProof/>
-              </w:rPr>
               <w:instrText xml:space="preserve"> PAGEREF _Toc232664117 \h </w:instrText>
-            </w:r>
-            <w:r>
-              <w:rPr>
-                <w:noProof/>
-              </w:rPr>
-            </w:r>
-            <w:r>
-              <w:rPr>
-                <w:noProof/>
-              </w:rPr>
               <w:fldChar w:fldCharType="separate"/>
-            </w:r>
-            <w:r>
-              <w:rPr>
-                <w:noProof/>
-              </w:rPr>
               <w:t>15</w:t>
-            </w:r>
-            <w:r>
-              <w:rPr>
-                <w:noProof/>
-              </w:rPr>
               <w:fldChar w:fldCharType="end"/>
             </w:r>
           </w:hyperlink>
@@ -2220,40 +1419,10 @@
                 <w:noProof/>
               </w:rPr>
               <w:tab/>
-            </w:r>
-            <w:r>
-              <w:rPr>
-                <w:noProof/>
-              </w:rPr>
               <w:fldChar w:fldCharType="begin"/>
-            </w:r>
-            <w:r>
-              <w:rPr>
-                <w:noProof/>
-              </w:rPr>
               <w:instrText xml:space="preserve"> PAGEREF _Toc232664118 \h </w:instrText>
-            </w:r>
-            <w:r>
-              <w:rPr>
-                <w:noProof/>
-              </w:rPr>
-            </w:r>
-            <w:r>
-              <w:rPr>
-                <w:noProof/>
-              </w:rPr>
               <w:fldChar w:fldCharType="separate"/>
-            </w:r>
-            <w:r>
-              <w:rPr>
-                <w:noProof/>
-              </w:rPr>
               <w:t>15</w:t>
-            </w:r>
-            <w:r>
-              <w:rPr>
-                <w:noProof/>
-              </w:rPr>
               <w:fldChar w:fldCharType="end"/>
             </w:r>
           </w:hyperlink>
@@ -2287,40 +1456,10 @@
                 <w:noProof/>
               </w:rPr>
               <w:tab/>
-            </w:r>
-            <w:r>
-              <w:rPr>
-                <w:noProof/>
-              </w:rPr>
               <w:fldChar w:fldCharType="begin"/>
-            </w:r>
-            <w:r>
-              <w:rPr>
-                <w:noProof/>
-              </w:rPr>
               <w:instrText xml:space="preserve"> PAGEREF _Toc232664119 \h </w:instrText>
-            </w:r>
-            <w:r>
-              <w:rPr>
-                <w:noProof/>
-              </w:rPr>
-            </w:r>
-            <w:r>
-              <w:rPr>
-                <w:noProof/>
-              </w:rPr>
               <w:fldChar w:fldCharType="separate"/>
-            </w:r>
-            <w:r>
-              <w:rPr>
-                <w:noProof/>
-              </w:rPr>
               <w:t>16</w:t>
-            </w:r>
-            <w:r>
-              <w:rPr>
-                <w:noProof/>
-              </w:rPr>
               <w:fldChar w:fldCharType="end"/>
             </w:r>
           </w:hyperlink>
@@ -2354,40 +1493,10 @@
                 <w:noProof/>
               </w:rPr>
               <w:tab/>
-            </w:r>
-            <w:r>
-              <w:rPr>
-                <w:noProof/>
-              </w:rPr>
               <w:fldChar w:fldCharType="begin"/>
-            </w:r>
-            <w:r>
-              <w:rPr>
-                <w:noProof/>
-              </w:rPr>
               <w:instrText xml:space="preserve"> PAGEREF _Toc232664120 \h </w:instrText>
-            </w:r>
-            <w:r>
-              <w:rPr>
-                <w:noProof/>
-              </w:rPr>
-            </w:r>
-            <w:r>
-              <w:rPr>
-                <w:noProof/>
-              </w:rPr>
               <w:fldChar w:fldCharType="separate"/>
-            </w:r>
-            <w:r>
-              <w:rPr>
-                <w:noProof/>
-              </w:rPr>
               <w:t>16</w:t>
-            </w:r>
-            <w:r>
-              <w:rPr>
-                <w:noProof/>
-              </w:rPr>
               <w:fldChar w:fldCharType="end"/>
             </w:r>
           </w:hyperlink>
@@ -2421,40 +1530,10 @@
                 <w:noProof/>
               </w:rPr>
               <w:tab/>
-            </w:r>
-            <w:r>
-              <w:rPr>
-                <w:noProof/>
-              </w:rPr>
               <w:fldChar w:fldCharType="begin"/>
-            </w:r>
-            <w:r>
-              <w:rPr>
-                <w:noProof/>
-              </w:rPr>
               <w:instrText xml:space="preserve"> PAGEREF _Toc232664121 \h </w:instrText>
-            </w:r>
-            <w:r>
-              <w:rPr>
-                <w:noProof/>
-              </w:rPr>
-            </w:r>
-            <w:r>
-              <w:rPr>
-                <w:noProof/>
-              </w:rPr>
               <w:fldChar w:fldCharType="separate"/>
-            </w:r>
-            <w:r>
-              <w:rPr>
-                <w:noProof/>
-              </w:rPr>
               <w:t>17</w:t>
-            </w:r>
-            <w:r>
-              <w:rPr>
-                <w:noProof/>
-              </w:rPr>
               <w:fldChar w:fldCharType="end"/>
             </w:r>
           </w:hyperlink>
@@ -2488,40 +1567,10 @@
                 <w:noProof/>
               </w:rPr>
               <w:tab/>
-            </w:r>
-            <w:r>
-              <w:rPr>
-                <w:noProof/>
-              </w:rPr>
               <w:fldChar w:fldCharType="begin"/>
-            </w:r>
-            <w:r>
-              <w:rPr>
-                <w:noProof/>
-              </w:rPr>
               <w:instrText xml:space="preserve"> PAGEREF _Toc232664122 \h </w:instrText>
-            </w:r>
-            <w:r>
-              <w:rPr>
-                <w:noProof/>
-              </w:rPr>
-            </w:r>
-            <w:r>
-              <w:rPr>
-                <w:noProof/>
-              </w:rPr>
               <w:fldChar w:fldCharType="separate"/>
-            </w:r>
-            <w:r>
-              <w:rPr>
-                <w:noProof/>
-              </w:rPr>
               <w:t>18</w:t>
-            </w:r>
-            <w:r>
-              <w:rPr>
-                <w:noProof/>
-              </w:rPr>
               <w:fldChar w:fldCharType="end"/>
             </w:r>
           </w:hyperlink>
@@ -2555,40 +1604,10 @@
                 <w:noProof/>
               </w:rPr>
               <w:tab/>
-            </w:r>
-            <w:r>
-              <w:rPr>
-                <w:noProof/>
-              </w:rPr>
               <w:fldChar w:fldCharType="begin"/>
-            </w:r>
-            <w:r>
-              <w:rPr>
-                <w:noProof/>
-              </w:rPr>
               <w:instrText xml:space="preserve"> PAGEREF _Toc232664123 \h </w:instrText>
-            </w:r>
-            <w:r>
-              <w:rPr>
-                <w:noProof/>
-              </w:rPr>
-            </w:r>
-            <w:r>
-              <w:rPr>
-                <w:noProof/>
-              </w:rPr>
               <w:fldChar w:fldCharType="separate"/>
-            </w:r>
-            <w:r>
-              <w:rPr>
-                <w:noProof/>
-              </w:rPr>
               <w:t>19</w:t>
-            </w:r>
-            <w:r>
-              <w:rPr>
-                <w:noProof/>
-              </w:rPr>
               <w:fldChar w:fldCharType="end"/>
             </w:r>
           </w:hyperlink>
@@ -2622,40 +1641,10 @@
                 <w:noProof/>
               </w:rPr>
               <w:tab/>
-            </w:r>
-            <w:r>
-              <w:rPr>
-                <w:noProof/>
-              </w:rPr>
               <w:fldChar w:fldCharType="begin"/>
-            </w:r>
-            <w:r>
-              <w:rPr>
-                <w:noProof/>
-              </w:rPr>
               <w:instrText xml:space="preserve"> PAGEREF _Toc232664124 \h </w:instrText>
-            </w:r>
-            <w:r>
-              <w:rPr>
-                <w:noProof/>
-              </w:rPr>
-            </w:r>
-            <w:r>
-              <w:rPr>
-                <w:noProof/>
-              </w:rPr>
               <w:fldChar w:fldCharType="separate"/>
-            </w:r>
-            <w:r>
-              <w:rPr>
-                <w:noProof/>
-              </w:rPr>
               <w:t>19</w:t>
-            </w:r>
-            <w:r>
-              <w:rPr>
-                <w:noProof/>
-              </w:rPr>
               <w:fldChar w:fldCharType="end"/>
             </w:r>
           </w:hyperlink>
@@ -2689,40 +1678,10 @@
                 <w:noProof/>
               </w:rPr>
               <w:tab/>
-            </w:r>
-            <w:r>
-              <w:rPr>
-                <w:noProof/>
-              </w:rPr>
               <w:fldChar w:fldCharType="begin"/>
-            </w:r>
-            <w:r>
-              <w:rPr>
-                <w:noProof/>
-              </w:rPr>
               <w:instrText xml:space="preserve"> PAGEREF _Toc232664125 \h </w:instrText>
-            </w:r>
-            <w:r>
-              <w:rPr>
-                <w:noProof/>
-              </w:rPr>
-            </w:r>
-            <w:r>
-              <w:rPr>
-                <w:noProof/>
-              </w:rPr>
               <w:fldChar w:fldCharType="separate"/>
-            </w:r>
-            <w:r>
-              <w:rPr>
-                <w:noProof/>
-              </w:rPr>
               <w:t>19</w:t>
-            </w:r>
-            <w:r>
-              <w:rPr>
-                <w:noProof/>
-              </w:rPr>
               <w:fldChar w:fldCharType="end"/>
             </w:r>
           </w:hyperlink>
@@ -2756,40 +1715,10 @@
                 <w:noProof/>
               </w:rPr>
               <w:tab/>
-            </w:r>
-            <w:r>
-              <w:rPr>
-                <w:noProof/>
-              </w:rPr>
               <w:fldChar w:fldCharType="begin"/>
-            </w:r>
-            <w:r>
-              <w:rPr>
-                <w:noProof/>
-              </w:rPr>
               <w:instrText xml:space="preserve"> PAGEREF _Toc232664126 \h </w:instrText>
-            </w:r>
-            <w:r>
-              <w:rPr>
-                <w:noProof/>
-              </w:rPr>
-            </w:r>
-            <w:r>
-              <w:rPr>
-                <w:noProof/>
-              </w:rPr>
               <w:fldChar w:fldCharType="separate"/>
-            </w:r>
-            <w:r>
-              <w:rPr>
-                <w:noProof/>
-              </w:rPr>
               <w:t>19</w:t>
-            </w:r>
-            <w:r>
-              <w:rPr>
-                <w:noProof/>
-              </w:rPr>
               <w:fldChar w:fldCharType="end"/>
             </w:r>
           </w:hyperlink>
@@ -2823,40 +1752,10 @@
                 <w:noProof/>
               </w:rPr>
               <w:tab/>
-            </w:r>
-            <w:r>
-              <w:rPr>
-                <w:noProof/>
-              </w:rPr>
               <w:fldChar w:fldCharType="begin"/>
-            </w:r>
-            <w:r>
-              <w:rPr>
-                <w:noProof/>
-              </w:rPr>
               <w:instrText xml:space="preserve"> PAGEREF _Toc232664127 \h </w:instrText>
-            </w:r>
-            <w:r>
-              <w:rPr>
-                <w:noProof/>
-              </w:rPr>
-            </w:r>
-            <w:r>
-              <w:rPr>
-                <w:noProof/>
-              </w:rPr>
               <w:fldChar w:fldCharType="separate"/>
-            </w:r>
-            <w:r>
-              <w:rPr>
-                <w:noProof/>
-              </w:rPr>
               <w:t>19</w:t>
-            </w:r>
-            <w:r>
-              <w:rPr>
-                <w:noProof/>
-              </w:rPr>
               <w:fldChar w:fldCharType="end"/>
             </w:r>
           </w:hyperlink>
@@ -2890,40 +1789,10 @@
                 <w:noProof/>
               </w:rPr>
               <w:tab/>
-            </w:r>
-            <w:r>
-              <w:rPr>
-                <w:noProof/>
-              </w:rPr>
               <w:fldChar w:fldCharType="begin"/>
-            </w:r>
-            <w:r>
-              <w:rPr>
-                <w:noProof/>
-              </w:rPr>
               <w:instrText xml:space="preserve"> PAGEREF _Toc232664128 \h </w:instrText>
-            </w:r>
-            <w:r>
-              <w:rPr>
-                <w:noProof/>
-              </w:rPr>
-            </w:r>
-            <w:r>
-              <w:rPr>
-                <w:noProof/>
-              </w:rPr>
               <w:fldChar w:fldCharType="separate"/>
-            </w:r>
-            <w:r>
-              <w:rPr>
-                <w:noProof/>
-              </w:rPr>
               <w:t>19</w:t>
-            </w:r>
-            <w:r>
-              <w:rPr>
-                <w:noProof/>
-              </w:rPr>
               <w:fldChar w:fldCharType="end"/>
             </w:r>
           </w:hyperlink>
@@ -2957,40 +1826,10 @@
                 <w:noProof/>
               </w:rPr>
               <w:tab/>
-            </w:r>
-            <w:r>
-              <w:rPr>
-                <w:noProof/>
-              </w:rPr>
               <w:fldChar w:fldCharType="begin"/>
-            </w:r>
-            <w:r>
-              <w:rPr>
-                <w:noProof/>
-              </w:rPr>
               <w:instrText xml:space="preserve"> PAGEREF _Toc232664129 \h </w:instrText>
-            </w:r>
-            <w:r>
-              <w:rPr>
-                <w:noProof/>
-              </w:rPr>
-            </w:r>
-            <w:r>
-              <w:rPr>
-                <w:noProof/>
-              </w:rPr>
               <w:fldChar w:fldCharType="separate"/>
-            </w:r>
-            <w:r>
-              <w:rPr>
-                <w:noProof/>
-              </w:rPr>
               <w:t>19</w:t>
-            </w:r>
-            <w:r>
-              <w:rPr>
-                <w:noProof/>
-              </w:rPr>
               <w:fldChar w:fldCharType="end"/>
             </w:r>
           </w:hyperlink>
@@ -3024,40 +1863,10 @@
                 <w:noProof/>
               </w:rPr>
               <w:tab/>
-            </w:r>
-            <w:r>
-              <w:rPr>
-                <w:noProof/>
-              </w:rPr>
               <w:fldChar w:fldCharType="begin"/>
-            </w:r>
-            <w:r>
-              <w:rPr>
-                <w:noProof/>
-              </w:rPr>
               <w:instrText xml:space="preserve"> PAGEREF _Toc232664130 \h </w:instrText>
-            </w:r>
-            <w:r>
-              <w:rPr>
-                <w:noProof/>
-              </w:rPr>
-            </w:r>
-            <w:r>
-              <w:rPr>
-                <w:noProof/>
-              </w:rPr>
               <w:fldChar w:fldCharType="separate"/>
-            </w:r>
-            <w:r>
-              <w:rPr>
-                <w:noProof/>
-              </w:rPr>
               <w:t>19</w:t>
-            </w:r>
-            <w:r>
-              <w:rPr>
-                <w:noProof/>
-              </w:rPr>
               <w:fldChar w:fldCharType="end"/>
             </w:r>
           </w:hyperlink>
@@ -3091,40 +1900,10 @@
                 <w:noProof/>
               </w:rPr>
               <w:tab/>
-            </w:r>
-            <w:r>
-              <w:rPr>
-                <w:noProof/>
-              </w:rPr>
               <w:fldChar w:fldCharType="begin"/>
-            </w:r>
-            <w:r>
-              <w:rPr>
-                <w:noProof/>
-              </w:rPr>
               <w:instrText xml:space="preserve"> PAGEREF _Toc232664131 \h </w:instrText>
-            </w:r>
-            <w:r>
-              <w:rPr>
-                <w:noProof/>
-              </w:rPr>
-            </w:r>
-            <w:r>
-              <w:rPr>
-                <w:noProof/>
-              </w:rPr>
               <w:fldChar w:fldCharType="separate"/>
-            </w:r>
-            <w:r>
-              <w:rPr>
-                <w:noProof/>
-              </w:rPr>
               <w:t>20</w:t>
-            </w:r>
-            <w:r>
-              <w:rPr>
-                <w:noProof/>
-              </w:rPr>
               <w:fldChar w:fldCharType="end"/>
             </w:r>
           </w:hyperlink>
@@ -3158,40 +1937,10 @@
                 <w:noProof/>
               </w:rPr>
               <w:tab/>
-            </w:r>
-            <w:r>
-              <w:rPr>
-                <w:noProof/>
-              </w:rPr>
               <w:fldChar w:fldCharType="begin"/>
-            </w:r>
-            <w:r>
-              <w:rPr>
-                <w:noProof/>
-              </w:rPr>
               <w:instrText xml:space="preserve"> PAGEREF _Toc232664132 \h </w:instrText>
-            </w:r>
-            <w:r>
-              <w:rPr>
-                <w:noProof/>
-              </w:rPr>
-            </w:r>
-            <w:r>
-              <w:rPr>
-                <w:noProof/>
-              </w:rPr>
               <w:fldChar w:fldCharType="separate"/>
-            </w:r>
-            <w:r>
-              <w:rPr>
-                <w:noProof/>
-              </w:rPr>
               <w:t>20</w:t>
-            </w:r>
-            <w:r>
-              <w:rPr>
-                <w:noProof/>
-              </w:rPr>
               <w:fldChar w:fldCharType="end"/>
             </w:r>
           </w:hyperlink>
@@ -3225,40 +1974,10 @@
                 <w:noProof/>
               </w:rPr>
               <w:tab/>
-            </w:r>
-            <w:r>
-              <w:rPr>
-                <w:noProof/>
-              </w:rPr>
               <w:fldChar w:fldCharType="begin"/>
-            </w:r>
-            <w:r>
-              <w:rPr>
-                <w:noProof/>
-              </w:rPr>
               <w:instrText xml:space="preserve"> PAGEREF _Toc232664133 \h </w:instrText>
-            </w:r>
-            <w:r>
-              <w:rPr>
-                <w:noProof/>
-              </w:rPr>
-            </w:r>
-            <w:r>
-              <w:rPr>
-                <w:noProof/>
-              </w:rPr>
               <w:fldChar w:fldCharType="separate"/>
-            </w:r>
-            <w:r>
-              <w:rPr>
-                <w:noProof/>
-              </w:rPr>
               <w:t>21</w:t>
-            </w:r>
-            <w:r>
-              <w:rPr>
-                <w:noProof/>
-              </w:rPr>
               <w:fldChar w:fldCharType="end"/>
             </w:r>
           </w:hyperlink>
@@ -3292,40 +2011,10 @@
                 <w:noProof/>
               </w:rPr>
               <w:tab/>
-            </w:r>
-            <w:r>
-              <w:rPr>
-                <w:noProof/>
-              </w:rPr>
               <w:fldChar w:fldCharType="begin"/>
-            </w:r>
-            <w:r>
-              <w:rPr>
-                <w:noProof/>
-              </w:rPr>
               <w:instrText xml:space="preserve"> PAGEREF _Toc232664134 \h </w:instrText>
-            </w:r>
-            <w:r>
-              <w:rPr>
-                <w:noProof/>
-              </w:rPr>
-            </w:r>
-            <w:r>
-              <w:rPr>
-                <w:noProof/>
-              </w:rPr>
               <w:fldChar w:fldCharType="separate"/>
-            </w:r>
-            <w:r>
-              <w:rPr>
-                <w:noProof/>
-              </w:rPr>
               <w:t>21</w:t>
-            </w:r>
-            <w:r>
-              <w:rPr>
-                <w:noProof/>
-              </w:rPr>
               <w:fldChar w:fldCharType="end"/>
             </w:r>
           </w:hyperlink>
@@ -3359,40 +2048,10 @@
                 <w:noProof/>
               </w:rPr>
               <w:tab/>
-            </w:r>
-            <w:r>
-              <w:rPr>
-                <w:noProof/>
-              </w:rPr>
               <w:fldChar w:fldCharType="begin"/>
-            </w:r>
-            <w:r>
-              <w:rPr>
-                <w:noProof/>
-              </w:rPr>
               <w:instrText xml:space="preserve"> PAGEREF _Toc232664135 \h </w:instrText>
-            </w:r>
-            <w:r>
-              <w:rPr>
-                <w:noProof/>
-              </w:rPr>
-            </w:r>
-            <w:r>
-              <w:rPr>
-                <w:noProof/>
-              </w:rPr>
               <w:fldChar w:fldCharType="separate"/>
-            </w:r>
-            <w:r>
-              <w:rPr>
-                <w:noProof/>
-              </w:rPr>
               <w:t>21</w:t>
-            </w:r>
-            <w:r>
-              <w:rPr>
-                <w:noProof/>
-              </w:rPr>
               <w:fldChar w:fldCharType="end"/>
             </w:r>
           </w:hyperlink>
@@ -3426,40 +2085,10 @@
                 <w:noProof/>
               </w:rPr>
               <w:tab/>
-            </w:r>
-            <w:r>
-              <w:rPr>
-                <w:noProof/>
-              </w:rPr>
               <w:fldChar w:fldCharType="begin"/>
-            </w:r>
-            <w:r>
-              <w:rPr>
-                <w:noProof/>
-              </w:rPr>
               <w:instrText xml:space="preserve"> PAGEREF _Toc232664136 \h </w:instrText>
-            </w:r>
-            <w:r>
-              <w:rPr>
-                <w:noProof/>
-              </w:rPr>
-            </w:r>
-            <w:r>
-              <w:rPr>
-                <w:noProof/>
-              </w:rPr>
               <w:fldChar w:fldCharType="separate"/>
-            </w:r>
-            <w:r>
-              <w:rPr>
-                <w:noProof/>
-              </w:rPr>
               <w:t>23</w:t>
-            </w:r>
-            <w:r>
-              <w:rPr>
-                <w:noProof/>
-              </w:rPr>
               <w:fldChar w:fldCharType="end"/>
             </w:r>
           </w:hyperlink>
@@ -3493,40 +2122,10 @@
                 <w:noProof/>
               </w:rPr>
               <w:tab/>
-            </w:r>
-            <w:r>
-              <w:rPr>
-                <w:noProof/>
-              </w:rPr>
               <w:fldChar w:fldCharType="begin"/>
-            </w:r>
-            <w:r>
-              <w:rPr>
-                <w:noProof/>
-              </w:rPr>
               <w:instrText xml:space="preserve"> PAGEREF _Toc232664137 \h </w:instrText>
-            </w:r>
-            <w:r>
-              <w:rPr>
-                <w:noProof/>
-              </w:rPr>
-            </w:r>
-            <w:r>
-              <w:rPr>
-                <w:noProof/>
-              </w:rPr>
               <w:fldChar w:fldCharType="separate"/>
-            </w:r>
-            <w:r>
-              <w:rPr>
-                <w:noProof/>
-              </w:rPr>
               <w:t>35</w:t>
-            </w:r>
-            <w:r>
-              <w:rPr>
-                <w:noProof/>
-              </w:rPr>
               <w:fldChar w:fldCharType="end"/>
             </w:r>
           </w:hyperlink>
@@ -3560,40 +2159,10 @@
                 <w:noProof/>
               </w:rPr>
               <w:tab/>
-            </w:r>
-            <w:r>
-              <w:rPr>
-                <w:noProof/>
-              </w:rPr>
               <w:fldChar w:fldCharType="begin"/>
-            </w:r>
-            <w:r>
-              <w:rPr>
-                <w:noProof/>
-              </w:rPr>
               <w:instrText xml:space="preserve"> PAGEREF _Toc232664138 \h </w:instrText>
-            </w:r>
-            <w:r>
-              <w:rPr>
-                <w:noProof/>
-              </w:rPr>
-            </w:r>
-            <w:r>
-              <w:rPr>
-                <w:noProof/>
-              </w:rPr>
               <w:fldChar w:fldCharType="separate"/>
-            </w:r>
-            <w:r>
-              <w:rPr>
-                <w:noProof/>
-              </w:rPr>
               <w:t>36</w:t>
-            </w:r>
-            <w:r>
-              <w:rPr>
-                <w:noProof/>
-              </w:rPr>
               <w:fldChar w:fldCharType="end"/>
             </w:r>
           </w:hyperlink>
@@ -3627,40 +2196,10 @@
                 <w:noProof/>
               </w:rPr>
               <w:tab/>
-            </w:r>
-            <w:r>
-              <w:rPr>
-                <w:noProof/>
-              </w:rPr>
               <w:fldChar w:fldCharType="begin"/>
-            </w:r>
-            <w:r>
-              <w:rPr>
-                <w:noProof/>
-              </w:rPr>
               <w:instrText xml:space="preserve"> PAGEREF _Toc232664139 \h </w:instrText>
-            </w:r>
-            <w:r>
-              <w:rPr>
-                <w:noProof/>
-              </w:rPr>
-            </w:r>
-            <w:r>
-              <w:rPr>
-                <w:noProof/>
-              </w:rPr>
               <w:fldChar w:fldCharType="separate"/>
-            </w:r>
-            <w:r>
-              <w:rPr>
-                <w:noProof/>
-              </w:rPr>
               <w:t>39</w:t>
-            </w:r>
-            <w:r>
-              <w:rPr>
-                <w:noProof/>
-              </w:rPr>
               <w:fldChar w:fldCharType="end"/>
             </w:r>
           </w:hyperlink>
@@ -3694,40 +2233,10 @@
                 <w:noProof/>
               </w:rPr>
               <w:tab/>
-            </w:r>
-            <w:r>
-              <w:rPr>
-                <w:noProof/>
-              </w:rPr>
               <w:fldChar w:fldCharType="begin"/>
-            </w:r>
-            <w:r>
-              <w:rPr>
-                <w:noProof/>
-              </w:rPr>
               <w:instrText xml:space="preserve"> PAGEREF _Toc232664140 \h </w:instrText>
-            </w:r>
-            <w:r>
-              <w:rPr>
-                <w:noProof/>
-              </w:rPr>
-            </w:r>
-            <w:r>
-              <w:rPr>
-                <w:noProof/>
-              </w:rPr>
               <w:fldChar w:fldCharType="separate"/>
-            </w:r>
-            <w:r>
-              <w:rPr>
-                <w:noProof/>
-              </w:rPr>
               <w:t>39</w:t>
-            </w:r>
-            <w:r>
-              <w:rPr>
-                <w:noProof/>
-              </w:rPr>
               <w:fldChar w:fldCharType="end"/>
             </w:r>
           </w:hyperlink>
@@ -3761,40 +2270,10 @@
                 <w:noProof/>
               </w:rPr>
               <w:tab/>
-            </w:r>
-            <w:r>
-              <w:rPr>
-                <w:noProof/>
-              </w:rPr>
               <w:fldChar w:fldCharType="begin"/>
-            </w:r>
-            <w:r>
-              <w:rPr>
-                <w:noProof/>
-              </w:rPr>
               <w:instrText xml:space="preserve"> PAGEREF _Toc232664141 \h </w:instrText>
-            </w:r>
-            <w:r>
-              <w:rPr>
-                <w:noProof/>
-              </w:rPr>
-            </w:r>
-            <w:r>
-              <w:rPr>
-                <w:noProof/>
-              </w:rPr>
               <w:fldChar w:fldCharType="separate"/>
-            </w:r>
-            <w:r>
-              <w:rPr>
-                <w:noProof/>
-              </w:rPr>
               <w:t>42</w:t>
-            </w:r>
-            <w:r>
-              <w:rPr>
-                <w:noProof/>
-              </w:rPr>
               <w:fldChar w:fldCharType="end"/>
             </w:r>
           </w:hyperlink>
@@ -3828,40 +2307,10 @@
                 <w:noProof/>
               </w:rPr>
               <w:tab/>
-            </w:r>
-            <w:r>
-              <w:rPr>
-                <w:noProof/>
-              </w:rPr>
               <w:fldChar w:fldCharType="begin"/>
-            </w:r>
-            <w:r>
-              <w:rPr>
-                <w:noProof/>
-              </w:rPr>
               <w:instrText xml:space="preserve"> PAGEREF _Toc232664142 \h </w:instrText>
-            </w:r>
-            <w:r>
-              <w:rPr>
-                <w:noProof/>
-              </w:rPr>
-            </w:r>
-            <w:r>
-              <w:rPr>
-                <w:noProof/>
-              </w:rPr>
               <w:fldChar w:fldCharType="separate"/>
-            </w:r>
-            <w:r>
-              <w:rPr>
-                <w:noProof/>
-              </w:rPr>
               <w:t>53</w:t>
-            </w:r>
-            <w:r>
-              <w:rPr>
-                <w:noProof/>
-              </w:rPr>
               <w:fldChar w:fldCharType="end"/>
             </w:r>
           </w:hyperlink>
@@ -3895,40 +2344,10 @@
                 <w:noProof/>
               </w:rPr>
               <w:tab/>
-            </w:r>
-            <w:r>
-              <w:rPr>
-                <w:noProof/>
-              </w:rPr>
               <w:fldChar w:fldCharType="begin"/>
-            </w:r>
-            <w:r>
-              <w:rPr>
-                <w:noProof/>
-              </w:rPr>
               <w:instrText xml:space="preserve"> PAGEREF _Toc232664143 \h </w:instrText>
-            </w:r>
-            <w:r>
-              <w:rPr>
-                <w:noProof/>
-              </w:rPr>
-            </w:r>
-            <w:r>
-              <w:rPr>
-                <w:noProof/>
-              </w:rPr>
               <w:fldChar w:fldCharType="separate"/>
-            </w:r>
-            <w:r>
-              <w:rPr>
-                <w:noProof/>
-              </w:rPr>
               <w:t>58</w:t>
-            </w:r>
-            <w:r>
-              <w:rPr>
-                <w:noProof/>
-              </w:rPr>
               <w:fldChar w:fldCharType="end"/>
             </w:r>
           </w:hyperlink>
@@ -3962,40 +2381,10 @@
                 <w:noProof/>
               </w:rPr>
               <w:tab/>
-            </w:r>
-            <w:r>
-              <w:rPr>
-                <w:noProof/>
-              </w:rPr>
               <w:fldChar w:fldCharType="begin"/>
-            </w:r>
-            <w:r>
-              <w:rPr>
-                <w:noProof/>
-              </w:rPr>
               <w:instrText xml:space="preserve"> PAGEREF _Toc232664144 \h </w:instrText>
-            </w:r>
-            <w:r>
-              <w:rPr>
-                <w:noProof/>
-              </w:rPr>
-            </w:r>
-            <w:r>
-              <w:rPr>
-                <w:noProof/>
-              </w:rPr>
               <w:fldChar w:fldCharType="separate"/>
-            </w:r>
-            <w:r>
-              <w:rPr>
-                <w:noProof/>
-              </w:rPr>
               <w:t>61</w:t>
-            </w:r>
-            <w:r>
-              <w:rPr>
-                <w:noProof/>
-              </w:rPr>
               <w:fldChar w:fldCharType="end"/>
             </w:r>
           </w:hyperlink>
@@ -4029,40 +2418,10 @@
                 <w:noProof/>
               </w:rPr>
               <w:tab/>
-            </w:r>
-            <w:r>
-              <w:rPr>
-                <w:noProof/>
-              </w:rPr>
               <w:fldChar w:fldCharType="begin"/>
-            </w:r>
-            <w:r>
-              <w:rPr>
-                <w:noProof/>
-              </w:rPr>
               <w:instrText xml:space="preserve"> PAGEREF _Toc232664145 \h </w:instrText>
-            </w:r>
-            <w:r>
-              <w:rPr>
-                <w:noProof/>
-              </w:rPr>
-            </w:r>
-            <w:r>
-              <w:rPr>
-                <w:noProof/>
-              </w:rPr>
               <w:fldChar w:fldCharType="separate"/>
-            </w:r>
-            <w:r>
-              <w:rPr>
-                <w:noProof/>
-              </w:rPr>
               <w:t>63</w:t>
-            </w:r>
-            <w:r>
-              <w:rPr>
-                <w:noProof/>
-              </w:rPr>
               <w:fldChar w:fldCharType="end"/>
             </w:r>
           </w:hyperlink>
@@ -4096,40 +2455,10 @@
                 <w:noProof/>
               </w:rPr>
               <w:tab/>
-            </w:r>
-            <w:r>
-              <w:rPr>
-                <w:noProof/>
-              </w:rPr>
               <w:fldChar w:fldCharType="begin"/>
-            </w:r>
-            <w:r>
-              <w:rPr>
-                <w:noProof/>
-              </w:rPr>
               <w:instrText xml:space="preserve"> PAGEREF _Toc232664146 \h </w:instrText>
-            </w:r>
-            <w:r>
-              <w:rPr>
-                <w:noProof/>
-              </w:rPr>
-            </w:r>
-            <w:r>
-              <w:rPr>
-                <w:noProof/>
-              </w:rPr>
               <w:fldChar w:fldCharType="separate"/>
-            </w:r>
-            <w:r>
-              <w:rPr>
-                <w:noProof/>
-              </w:rPr>
               <w:t>65</w:t>
-            </w:r>
-            <w:r>
-              <w:rPr>
-                <w:noProof/>
-              </w:rPr>
               <w:fldChar w:fldCharType="end"/>
             </w:r>
           </w:hyperlink>
@@ -4163,40 +2492,10 @@
                 <w:noProof/>
               </w:rPr>
               <w:tab/>
-            </w:r>
-            <w:r>
-              <w:rPr>
-                <w:noProof/>
-              </w:rPr>
               <w:fldChar w:fldCharType="begin"/>
-            </w:r>
-            <w:r>
-              <w:rPr>
-                <w:noProof/>
-              </w:rPr>
               <w:instrText xml:space="preserve"> PAGEREF _Toc232664147 \h </w:instrText>
-            </w:r>
-            <w:r>
-              <w:rPr>
-                <w:noProof/>
-              </w:rPr>
-            </w:r>
-            <w:r>
-              <w:rPr>
-                <w:noProof/>
-              </w:rPr>
               <w:fldChar w:fldCharType="separate"/>
-            </w:r>
-            <w:r>
-              <w:rPr>
-                <w:noProof/>
-              </w:rPr>
               <w:t>65</w:t>
-            </w:r>
-            <w:r>
-              <w:rPr>
-                <w:noProof/>
-              </w:rPr>
               <w:fldChar w:fldCharType="end"/>
             </w:r>
           </w:hyperlink>
@@ -4230,40 +2529,10 @@
                 <w:noProof/>
               </w:rPr>
               <w:tab/>
-            </w:r>
-            <w:r>
-              <w:rPr>
-                <w:noProof/>
-              </w:rPr>
               <w:fldChar w:fldCharType="begin"/>
-            </w:r>
-            <w:r>
-              <w:rPr>
-                <w:noProof/>
-              </w:rPr>
               <w:instrText xml:space="preserve"> PAGEREF _Toc232664148 \h </w:instrText>
-            </w:r>
-            <w:r>
-              <w:rPr>
-                <w:noProof/>
-              </w:rPr>
-            </w:r>
-            <w:r>
-              <w:rPr>
-                <w:noProof/>
-              </w:rPr>
               <w:fldChar w:fldCharType="separate"/>
-            </w:r>
-            <w:r>
-              <w:rPr>
-                <w:noProof/>
-              </w:rPr>
               <w:t>65</w:t>
-            </w:r>
-            <w:r>
-              <w:rPr>
-                <w:noProof/>
-              </w:rPr>
               <w:fldChar w:fldCharType="end"/>
             </w:r>
           </w:hyperlink>
@@ -4297,40 +2566,10 @@
                 <w:noProof/>
               </w:rPr>
               <w:tab/>
-            </w:r>
-            <w:r>
-              <w:rPr>
-                <w:noProof/>
-              </w:rPr>
               <w:fldChar w:fldCharType="begin"/>
-            </w:r>
-            <w:r>
-              <w:rPr>
-                <w:noProof/>
-              </w:rPr>
               <w:instrText xml:space="preserve"> PAGEREF _Toc232664149 \h </w:instrText>
-            </w:r>
-            <w:r>
-              <w:rPr>
-                <w:noProof/>
-              </w:rPr>
-            </w:r>
-            <w:r>
-              <w:rPr>
-                <w:noProof/>
-              </w:rPr>
               <w:fldChar w:fldCharType="separate"/>
-            </w:r>
-            <w:r>
-              <w:rPr>
-                <w:noProof/>
-              </w:rPr>
               <w:t>65</w:t>
-            </w:r>
-            <w:r>
-              <w:rPr>
-                <w:noProof/>
-              </w:rPr>
               <w:fldChar w:fldCharType="end"/>
             </w:r>
           </w:hyperlink>
@@ -4364,40 +2603,10 @@
                 <w:noProof/>
               </w:rPr>
               <w:tab/>
-            </w:r>
-            <w:r>
-              <w:rPr>
-                <w:noProof/>
-              </w:rPr>
               <w:fldChar w:fldCharType="begin"/>
-            </w:r>
-            <w:r>
-              <w:rPr>
-                <w:noProof/>
-              </w:rPr>
               <w:instrText xml:space="preserve"> PAGEREF _Toc232664150 \h </w:instrText>
-            </w:r>
-            <w:r>
-              <w:rPr>
-                <w:noProof/>
-              </w:rPr>
-            </w:r>
-            <w:r>
-              <w:rPr>
-                <w:noProof/>
-              </w:rPr>
               <w:fldChar w:fldCharType="separate"/>
-            </w:r>
-            <w:r>
-              <w:rPr>
-                <w:noProof/>
-              </w:rPr>
               <w:t>65</w:t>
-            </w:r>
-            <w:r>
-              <w:rPr>
-                <w:noProof/>
-              </w:rPr>
               <w:fldChar w:fldCharType="end"/>
             </w:r>
           </w:hyperlink>
@@ -4431,40 +2640,10 @@
                 <w:noProof/>
               </w:rPr>
               <w:tab/>
-            </w:r>
-            <w:r>
-              <w:rPr>
-                <w:noProof/>
-              </w:rPr>
               <w:fldChar w:fldCharType="begin"/>
-            </w:r>
-            <w:r>
-              <w:rPr>
-                <w:noProof/>
-              </w:rPr>
               <w:instrText xml:space="preserve"> PAGEREF _Toc232664151 \h </w:instrText>
-            </w:r>
-            <w:r>
-              <w:rPr>
-                <w:noProof/>
-              </w:rPr>
-            </w:r>
-            <w:r>
-              <w:rPr>
-                <w:noProof/>
-              </w:rPr>
               <w:fldChar w:fldCharType="separate"/>
-            </w:r>
-            <w:r>
-              <w:rPr>
-                <w:noProof/>
-              </w:rPr>
               <w:t>65</w:t>
-            </w:r>
-            <w:r>
-              <w:rPr>
-                <w:noProof/>
-              </w:rPr>
               <w:fldChar w:fldCharType="end"/>
             </w:r>
           </w:hyperlink>
@@ -4498,40 +2677,10 @@
                 <w:noProof/>
               </w:rPr>
               <w:tab/>
-            </w:r>
-            <w:r>
-              <w:rPr>
-                <w:noProof/>
-              </w:rPr>
               <w:fldChar w:fldCharType="begin"/>
-            </w:r>
-            <w:r>
-              <w:rPr>
-                <w:noProof/>
-              </w:rPr>
               <w:instrText xml:space="preserve"> PAGEREF _Toc232664152 \h </w:instrText>
-            </w:r>
-            <w:r>
-              <w:rPr>
-                <w:noProof/>
-              </w:rPr>
-            </w:r>
-            <w:r>
-              <w:rPr>
-                <w:noProof/>
-              </w:rPr>
               <w:fldChar w:fldCharType="separate"/>
-            </w:r>
-            <w:r>
-              <w:rPr>
-                <w:noProof/>
-              </w:rPr>
               <w:t>65</w:t>
-            </w:r>
-            <w:r>
-              <w:rPr>
-                <w:noProof/>
-              </w:rPr>
               <w:fldChar w:fldCharType="end"/>
             </w:r>
           </w:hyperlink>
@@ -4565,40 +2714,10 @@
                 <w:noProof/>
               </w:rPr>
               <w:tab/>
-            </w:r>
-            <w:r>
-              <w:rPr>
-                <w:noProof/>
-              </w:rPr>
               <w:fldChar w:fldCharType="begin"/>
-            </w:r>
-            <w:r>
-              <w:rPr>
-                <w:noProof/>
-              </w:rPr>
               <w:instrText xml:space="preserve"> PAGEREF _Toc232664153 \h </w:instrText>
-            </w:r>
-            <w:r>
-              <w:rPr>
-                <w:noProof/>
-              </w:rPr>
-            </w:r>
-            <w:r>
-              <w:rPr>
-                <w:noProof/>
-              </w:rPr>
               <w:fldChar w:fldCharType="separate"/>
-            </w:r>
-            <w:r>
-              <w:rPr>
-                <w:noProof/>
-              </w:rPr>
               <w:t>65</w:t>
-            </w:r>
-            <w:r>
-              <w:rPr>
-                <w:noProof/>
-              </w:rPr>
               <w:fldChar w:fldCharType="end"/>
             </w:r>
           </w:hyperlink>
@@ -4632,40 +2751,10 @@
                 <w:noProof/>
               </w:rPr>
               <w:tab/>
-            </w:r>
-            <w:r>
-              <w:rPr>
-                <w:noProof/>
-              </w:rPr>
               <w:fldChar w:fldCharType="begin"/>
-            </w:r>
-            <w:r>
-              <w:rPr>
-                <w:noProof/>
-              </w:rPr>
               <w:instrText xml:space="preserve"> PAGEREF _Toc232664154 \h </w:instrText>
-            </w:r>
-            <w:r>
-              <w:rPr>
-                <w:noProof/>
-              </w:rPr>
-            </w:r>
-            <w:r>
-              <w:rPr>
-                <w:noProof/>
-              </w:rPr>
               <w:fldChar w:fldCharType="separate"/>
-            </w:r>
-            <w:r>
-              <w:rPr>
-                <w:noProof/>
-              </w:rPr>
               <w:t>66</w:t>
-            </w:r>
-            <w:r>
-              <w:rPr>
-                <w:noProof/>
-              </w:rPr>
               <w:fldChar w:fldCharType="end"/>
             </w:r>
           </w:hyperlink>
@@ -4699,40 +2788,10 @@
                 <w:noProof/>
               </w:rPr>
               <w:tab/>
-            </w:r>
-            <w:r>
-              <w:rPr>
-                <w:noProof/>
-              </w:rPr>
               <w:fldChar w:fldCharType="begin"/>
-            </w:r>
-            <w:r>
-              <w:rPr>
-                <w:noProof/>
-              </w:rPr>
               <w:instrText xml:space="preserve"> PAGEREF _Toc232664155 \h </w:instrText>
-            </w:r>
-            <w:r>
-              <w:rPr>
-                <w:noProof/>
-              </w:rPr>
-            </w:r>
-            <w:r>
-              <w:rPr>
-                <w:noProof/>
-              </w:rPr>
               <w:fldChar w:fldCharType="separate"/>
-            </w:r>
-            <w:r>
-              <w:rPr>
-                <w:noProof/>
-              </w:rPr>
               <w:t>67</w:t>
-            </w:r>
-            <w:r>
-              <w:rPr>
-                <w:noProof/>
-              </w:rPr>
               <w:fldChar w:fldCharType="end"/>
             </w:r>
           </w:hyperlink>
@@ -4766,40 +2825,10 @@
                 <w:noProof/>
               </w:rPr>
               <w:tab/>
-            </w:r>
-            <w:r>
-              <w:rPr>
-                <w:noProof/>
-              </w:rPr>
               <w:fldChar w:fldCharType="begin"/>
-            </w:r>
-            <w:r>
-              <w:rPr>
-                <w:noProof/>
-              </w:rPr>
               <w:instrText xml:space="preserve"> PAGEREF _Toc232664156 \h </w:instrText>
-            </w:r>
-            <w:r>
-              <w:rPr>
-                <w:noProof/>
-              </w:rPr>
-            </w:r>
-            <w:r>
-              <w:rPr>
-                <w:noProof/>
-              </w:rPr>
               <w:fldChar w:fldCharType="separate"/>
-            </w:r>
-            <w:r>
-              <w:rPr>
-                <w:noProof/>
-              </w:rPr>
               <w:t>67</w:t>
-            </w:r>
-            <w:r>
-              <w:rPr>
-                <w:noProof/>
-              </w:rPr>
               <w:fldChar w:fldCharType="end"/>
             </w:r>
           </w:hyperlink>
@@ -4833,40 +2862,10 @@
                 <w:noProof/>
               </w:rPr>
               <w:tab/>
-            </w:r>
-            <w:r>
-              <w:rPr>
-                <w:noProof/>
-              </w:rPr>
               <w:fldChar w:fldCharType="begin"/>
-            </w:r>
-            <w:r>
-              <w:rPr>
-                <w:noProof/>
-              </w:rPr>
               <w:instrText xml:space="preserve"> PAGEREF _Toc232664157 \h </w:instrText>
-            </w:r>
-            <w:r>
-              <w:rPr>
-                <w:noProof/>
-              </w:rPr>
-            </w:r>
-            <w:r>
-              <w:rPr>
-                <w:noProof/>
-              </w:rPr>
               <w:fldChar w:fldCharType="separate"/>
-            </w:r>
-            <w:r>
-              <w:rPr>
-                <w:noProof/>
-              </w:rPr>
               <w:t>67</w:t>
-            </w:r>
-            <w:r>
-              <w:rPr>
-                <w:noProof/>
-              </w:rPr>
               <w:fldChar w:fldCharType="end"/>
             </w:r>
           </w:hyperlink>
@@ -4900,40 +2899,10 @@
                 <w:noProof/>
               </w:rPr>
               <w:tab/>
-            </w:r>
-            <w:r>
-              <w:rPr>
-                <w:noProof/>
-              </w:rPr>
               <w:fldChar w:fldCharType="begin"/>
-            </w:r>
-            <w:r>
-              <w:rPr>
-                <w:noProof/>
-              </w:rPr>
               <w:instrText xml:space="preserve"> PAGEREF _Toc232664158 \h </w:instrText>
-            </w:r>
-            <w:r>
-              <w:rPr>
-                <w:noProof/>
-              </w:rPr>
-            </w:r>
-            <w:r>
-              <w:rPr>
-                <w:noProof/>
-              </w:rPr>
               <w:fldChar w:fldCharType="separate"/>
-            </w:r>
-            <w:r>
-              <w:rPr>
-                <w:noProof/>
-              </w:rPr>
               <w:t>67</w:t>
-            </w:r>
-            <w:r>
-              <w:rPr>
-                <w:noProof/>
-              </w:rPr>
               <w:fldChar w:fldCharType="end"/>
             </w:r>
           </w:hyperlink>
@@ -4967,40 +2936,10 @@
                 <w:noProof/>
               </w:rPr>
               <w:tab/>
-            </w:r>
-            <w:r>
-              <w:rPr>
-                <w:noProof/>
-              </w:rPr>
               <w:fldChar w:fldCharType="begin"/>
-            </w:r>
-            <w:r>
-              <w:rPr>
-                <w:noProof/>
-              </w:rPr>
               <w:instrText xml:space="preserve"> PAGEREF _Toc232664159 \h </w:instrText>
-            </w:r>
-            <w:r>
-              <w:rPr>
-                <w:noProof/>
-              </w:rPr>
-            </w:r>
-            <w:r>
-              <w:rPr>
-                <w:noProof/>
-              </w:rPr>
               <w:fldChar w:fldCharType="separate"/>
-            </w:r>
-            <w:r>
-              <w:rPr>
-                <w:noProof/>
-              </w:rPr>
               <w:t>68</w:t>
-            </w:r>
-            <w:r>
-              <w:rPr>
-                <w:noProof/>
-              </w:rPr>
               <w:fldChar w:fldCharType="end"/>
             </w:r>
           </w:hyperlink>
@@ -5034,40 +2973,10 @@
                 <w:noProof/>
               </w:rPr>
               <w:tab/>
-            </w:r>
-            <w:r>
-              <w:rPr>
-                <w:noProof/>
-              </w:rPr>
               <w:fldChar w:fldCharType="begin"/>
-            </w:r>
-            <w:r>
-              <w:rPr>
-                <w:noProof/>
-              </w:rPr>
               <w:instrText xml:space="preserve"> PAGEREF _Toc232664160 \h </w:instrText>
-            </w:r>
-            <w:r>
-              <w:rPr>
-                <w:noProof/>
-              </w:rPr>
-            </w:r>
-            <w:r>
-              <w:rPr>
-                <w:noProof/>
-              </w:rPr>
               <w:fldChar w:fldCharType="separate"/>
-            </w:r>
-            <w:r>
-              <w:rPr>
-                <w:noProof/>
-              </w:rPr>
               <w:t>68</w:t>
-            </w:r>
-            <w:r>
-              <w:rPr>
-                <w:noProof/>
-              </w:rPr>
               <w:fldChar w:fldCharType="end"/>
             </w:r>
           </w:hyperlink>
@@ -5101,40 +3010,10 @@
                 <w:noProof/>
               </w:rPr>
               <w:tab/>
-            </w:r>
-            <w:r>
-              <w:rPr>
-                <w:noProof/>
-              </w:rPr>
               <w:fldChar w:fldCharType="begin"/>
-            </w:r>
-            <w:r>
-              <w:rPr>
-                <w:noProof/>
-              </w:rPr>
               <w:instrText xml:space="preserve"> PAGEREF _Toc232664161 \h </w:instrText>
-            </w:r>
-            <w:r>
-              <w:rPr>
-                <w:noProof/>
-              </w:rPr>
-            </w:r>
-            <w:r>
-              <w:rPr>
-                <w:noProof/>
-              </w:rPr>
               <w:fldChar w:fldCharType="separate"/>
-            </w:r>
-            <w:r>
-              <w:rPr>
-                <w:noProof/>
-              </w:rPr>
               <w:t>69</w:t>
-            </w:r>
-            <w:r>
-              <w:rPr>
-                <w:noProof/>
-              </w:rPr>
               <w:fldChar w:fldCharType="end"/>
             </w:r>
           </w:hyperlink>
@@ -5182,13 +3061,7 @@
         <w:rPr>
           <w:rtl/>
         </w:rPr>
-        <w:t>يشهد قطاع الرعاية الصحية تحوّلاً رقمياً متسارعاً يَعِد بتحسين جودة الخدمة ورفع كفاءة العمل الطبي، غير أنّ كثيراً من المؤسسات الصحية ما زالت تعتمد على أنظمةٍ منعزلة تخزّن بيانات المريض بصِيَغٍ خاصّة لا يفهمها سواها. ويؤدّي هذا التشتّت إلى صعوبة تبادل المعلومات بين المشافي والعيادات والمخابر، وإلى تكرار الفحوص وإهدار الموارد، وإلى قراراتٍ سريرية تُتّخذ أحياناً من دون صورةٍ كاملة عن تاريخ المريض. كما تبقى الرعاية في كثيرٍ من الأنظمة ذات طابعٍ تفاعلي (Reactive) أكثر منه استباقي (Proactive)؛ إذ يُكتشَف ارتفاع خط</w:t>
-      </w:r>
-      <w:r>
-        <w:rPr>
-          <w:rtl/>
-        </w:rPr>
-        <w:t>ورة حالة المريض في وقتٍ متأخّر بسبب غياب أدواتٍ تنبّؤية تعمل في موضع الرعاية وتساعد الطبيب على اتخاذ القرار المناسب في الوقت المناسب.</w:t>
+        <w:t>يشهد قطاع الرعاية الصحية تحوّلاً رقمياً متسارعاً يَعِد بتحسين جودة الخدمة ورفع كفاءة العمل الطبي، غير أنّ كثيراً من المؤسسات الصحية ما زالت تعتمد على أنظمةٍ منعزلة تخزّن بيانات المريض بصِيَغٍ خاصّة لا يفهمها سواها. ويؤدّي هذا التشتّت إلى صعوبة تبادل المعلومات بين المشافي والعيادات والمخابر، وإلى تكرار الفحوص وإهدار الموارد، وإلى قراراتٍ سريرية تُتّخذ أحياناً من دون صورةٍ كاملة عن تاريخ المريض. كما تبقى الرعاية في كثيرٍ من الأنظمة ذات طابعٍ تفاعلي (Reactive) أكثر منه استباقي (Proactive)؛ إذ يُكتشَف ارتفاع خطورة حالة المريض في وقتٍ متأخّر بسبب غياب أدواتٍ تنبّؤية تعمل في موضع الرعاية وتساعد الطبيب على اتخاذ القرار المناسب في الوقت المناسب.</w:t>
       </w:r>
     </w:p>
     <w:p>
@@ -5201,13 +3074,7 @@
         <w:rPr>
           <w:rtl/>
         </w:rPr>
-        <w:t>ولمواجهة هذه التحديات، صمّمنا «نظام السجلات الطبية الرقمية» (DMRS): منصّةٌ متكاملة تعتمد على المعيار العالمي HL7 FHIR في إصداره الخامس [1] لتوحيد تمثيل البيانات الصحية وضمان قابلية تبادلها بين الأنظمة المختلفة، وتضيف فوق هذا السجلّ محرّك دعمٍ للقرار السريري قابلاً للتهيئة وفق مواصفة CDS Hooks [13]، وطبقة ذكاء اصطناعي تُقدّر مخاطر المريض من بياناته الفعلية، وبوابةً يطّلع المريض من خلالها على سجلّه الصحّي. وقد روعيَ في التصميم أن يكون النظام قابلاً للتوسّع والصيانة، وأن يلتزم بمعايير الأمان وحماية الخصوصية ال</w:t>
-      </w:r>
-      <w:r>
-        <w:rPr>
-          <w:rtl/>
-        </w:rPr>
-        <w:t>مناسبة للبيانات الصحية الحسّاسة.</w:t>
+        <w:t>ولمواجهة هذه التحديات، صمّمنا «نظام السجلات الطبية الرقمية» (DMRS): منصّةٌ متكاملة تعتمد على المعيار العالمي HL7 FHIR في إصداره الخامس [1] لتوحيد تمثيل البيانات الصحية وضمان قابلية تبادلها بين الأنظمة المختلفة، وتضيف فوق هذا السجلّ محرّك دعمٍ للقرار السريري قابلاً للتهيئة وفق مواصفة CDS Hooks [13]، وطبقة ذكاء اصطناعي تُقدّر مخاطر المريض من بياناته الفعلية، وبوابةً يطّلع المريض من خلالها على سجلّه الصحّي. وقد روعيَ في التصميم أن يكون النظام قابلاً للتوسّع والصيانة، وأن يلتزم بمعايير الأمان وحماية الخصوصية المناسبة للبيانات الصحية الحسّاسة.</w:t>
       </w:r>
     </w:p>
     <w:p>
@@ -9670,13 +7537,7 @@
         <w:rPr>
           <w:rtl/>
         </w:rPr>
-        <w:t>يعتمد النظام نموذج تحكّمٍ بالوصول قائم على الأدوار (RBAC) مدعوماً بنطاقات صلاحياتٍ على غرار SMART on FHIR [19]. فبعد مصادقة المستخدم عبر Keycloak [8] وفق OAuth2/OpenID Connect [18] يحمل رمز الدخول (JWT) أدواره، ويتحقّق الخادم من كلّ طلبٍ ليقرّر ما إذا كان مسموحاً. ويميّز النظام بين ثلاثة أنواعٍ من النطاقات: نطاق النظام (System) للعمليات الإدارية على مستوى المنصّة، ونطاق المستخدم (User) للكادر الذي يصل إلى بيانات المرضى ضمن صلاحيته، ونطاق المريض (Patient) الذي يقيّد المريض ببياناته هو فقط. ويلخّص الجدول الآت</w:t>
-      </w:r>
-      <w:r>
-        <w:rPr>
-          <w:rtl/>
-        </w:rPr>
-        <w:t>ي توزيع الصلاحيات على الأدوار:</w:t>
+        <w:t>يعتمد النظام نموذج تحكّمٍ بالوصول قائم على الأدوار (RBAC) مدعوماً بنطاقات صلاحياتٍ على غرار SMART on FHIR [19]. فبعد مصادقة المستخدم عبر Keycloak [8] وفق OAuth2/OpenID Connect [18] يحمل رمز الدخول (JWT) أدواره، ويتحقّق الخادم من كلّ طلبٍ ليقرّر ما إذا كان مسموحاً. ويميّز النظام بين ثلاثة أنواعٍ من النطاقات: نطاق النظام (System) للعمليات الإدارية على مستوى المنصّة، ونطاق المستخدم (User) للكادر الذي يصل إلى بيانات المرضى ضمن صلاحيته، ونطاق المريض (Patient) الذي يقيّد المريض ببياناته هو فقط. ويلخّص الجدول الآتي توزيع الصلاحيات على الأدوار:</w:t>
       </w:r>
     </w:p>
     <w:tbl>
@@ -10040,6 +7901,19 @@
           <w:rtl/>
         </w:rPr>
         <w:t>جدول 3-19: توزيع الصلاحيات على الأدوار.</w:t>
+      </w:r>
+    </w:p>
+    <w:p>
+      <w:pPr>
+        <w:bidi/>
+        <w:spacing w:after="120" w:line="312" w:lineRule="auto"/>
+        <w:jc w:val="both"/>
+      </w:pPr>
+      <w:r>
+        <w:rPr>
+          <w:rtl/>
+        </w:rPr>
+        <w:t>ويتبنّى النظام نموذج السجلّ الطبي الوطني (National Record): فبما أنّ المريض قد يُعالَج في أكثر من جهة، يُتاح لأيّ عضو كادرٍ طبي (طبيب/ممارس) الاطّلاع على سجلّ أيّ مريضٍ في المنصّة والمساهمة في بياناته السريرية عبر المؤسسات كافّة — أي إنشاء الحالات والملاحظات والإجراءات والأدوية وطلبات الخدمة والحساسيات والزيارات والمواعيد وتحديثها بصرف النظر عن المؤسسة المالكة للسجل. وبذلك تكتمل فائدة القراءة عبر المؤسسات: فلا يقتصر الطبيب على مطالعة سجلّ مريضٍ مُحال إليه من جهةٍ أخرى، بل يستطيع أيضاً وصف الدواء وتوثيق الرعاية له. أمّا تعديل البيانات التعريفية (الديموغرافية) للمريض، وعمليات الحذف، والبيانات الإدارية (المؤسسات والمواقع والكادر) فتبقى مقيَّدةً بمؤسسة الكادر، حفاظاً على ملكية كلّ مؤسسةٍ لبياناتها الإدارية.</w:t>
       </w:r>
     </w:p>
     <w:p>
@@ -31341,11 +29215,6 @@
           <w:rtl/>
         </w:rPr>
         <w:t xml:space="preserve">تعتمد قاعدة البيانات تصميماً «عامّاً» (Generic) يخزّن كلّ مورد FHIR بصيغته الأصلية (JSON عبر نوع JSONB في PostgreSQL [6]) في جدول FhirResources، مع جدول FhirResourceVersions لحفظ تاريخ النسخ كاملاً، وجدول ResourceIndices لفهرسة الحقول القابلة للبحث؛ ما يمنح مرونةً في دعم أنواع موارد متعدّدة من دون تغيير المخطّط. وتُضاف جداول دعم القرار </w:t>
-      </w:r>
-      <w:r>
-        <w:rPr>
-          <w:rtl/>
-        </w:rPr>
         <w:lastRenderedPageBreak/>
         <w:t>CdsRuleDefinitions وCdsRuleVersions، وجدول معرفة الأدوية MedicineKnowledgeRecords، وجدول نماذج الذكاء الاصطناعي الخارجية ExternalAiModels. أمّا خدمة الأدوية فلها قاعدتها الخاصة (DMRSMedicine) التي تضمّ جدولَي Medicine وIngredient بعلاقة متعدّد-إلى-متعدّد.</w:t>
       </w:r>

</xml_diff>